<commit_message>
Add Șiruri chapter (theory + exercises)
Also syncs the printable formula sheet (public/formule-bacalaureat.pdf
and .docx) to include the 4 new ninth-grade chapters added across this
plan (multimi-logica, functia-gradul-1, functia-gradul-2, siruri),
since editing src/data/formulaSheet.ts requires regenerating those
files per its own header comment.
</commit_message>
<xml_diff>
--- a/public/formule-bacalaureat.docx
+++ b/public/formule-bacalaureat.docx
@@ -766,6 +766,252 @@
       </w:r>
       <w:r>
         <w:t xml:space="preserve">x∘x' = x'∘x = e</w:t>
+      </w:r>
+    </w:p>
+    <w:p>
+      <w:pPr>
+        <w:pStyle w:val="Heading2"/>
+        <w:spacing w:after="150" w:before="300"/>
+      </w:pPr>
+      <w:r>
+        <w:t xml:space="preserve">Mulțimi și logică matematică</w:t>
+      </w:r>
+    </w:p>
+    <w:p>
+      <w:pPr>
+        <w:spacing w:after="100"/>
+      </w:pPr>
+      <w:r>
+        <w:rPr>
+          <w:b/>
+          <w:bCs/>
+        </w:rPr>
+        <w:t xml:space="preserve">Reuniunea mulțimilor: </w:t>
+      </w:r>
+      <w:r>
+        <w:t xml:space="preserve">A ∪ B = {x | x ∈ A or x ∈ B}</w:t>
+      </w:r>
+    </w:p>
+    <w:p>
+      <w:pPr>
+        <w:spacing w:after="100"/>
+      </w:pPr>
+      <w:r>
+        <w:rPr>
+          <w:b/>
+          <w:bCs/>
+        </w:rPr>
+        <w:t xml:space="preserve">Intersecția mulțimilor: </w:t>
+      </w:r>
+      <w:r>
+        <w:t xml:space="preserve">A ∩ B = {x | x ∈ A and x ∈ B}</w:t>
+      </w:r>
+    </w:p>
+    <w:p>
+      <w:pPr>
+        <w:spacing w:after="100"/>
+      </w:pPr>
+      <w:r>
+        <w:rPr>
+          <w:b/>
+          <w:bCs/>
+        </w:rPr>
+        <w:t xml:space="preserve">Diferența mulțimilor: </w:t>
+      </w:r>
+      <w:r>
+        <w:t xml:space="preserve">A \ B = {x | x ∈ A and x ∉ B}</w:t>
+      </w:r>
+    </w:p>
+    <w:p>
+      <w:pPr>
+        <w:spacing w:after="100"/>
+      </w:pPr>
+      <w:r>
+        <w:rPr>
+          <w:b/>
+          <w:bCs/>
+        </w:rPr>
+        <w:t xml:space="preserve">Complementara: </w:t>
+      </w:r>
+      <w:r>
+        <w:t xml:space="preserve">C_E(A) = E \ A</w:t>
+      </w:r>
+    </w:p>
+    <w:p>
+      <w:pPr>
+        <w:pStyle w:val="Heading2"/>
+        <w:spacing w:after="150" w:before="300"/>
+      </w:pPr>
+      <w:r>
+        <w:t xml:space="preserve">Funcția de gradul I</w:t>
+      </w:r>
+    </w:p>
+    <w:p>
+      <w:pPr>
+        <w:spacing w:after="100"/>
+      </w:pPr>
+      <w:r>
+        <w:rPr>
+          <w:b/>
+          <w:bCs/>
+        </w:rPr>
+        <w:t xml:space="preserve">Funcția de gradul I: </w:t>
+      </w:r>
+      <w:r>
+        <w:t xml:space="preserve">f(x) = ax + b,  a, b ∈ ℝ,  a ≠ 0</w:t>
+      </w:r>
+    </w:p>
+    <w:p>
+      <w:pPr>
+        <w:spacing w:after="100"/>
+      </w:pPr>
+      <w:r>
+        <w:rPr>
+          <w:b/>
+          <w:bCs/>
+        </w:rPr>
+        <w:t xml:space="preserve">Intersecția cu axele de coordonate: </w:t>
+      </w:r>
+      <w:r>
+        <w:t xml:space="preserve">f(0) = b;  f(x) = 0  ⇒  x = −b/a</w:t>
+      </w:r>
+    </w:p>
+    <w:p>
+      <w:pPr>
+        <w:spacing w:after="100"/>
+      </w:pPr>
+      <w:r>
+        <w:rPr>
+          <w:b/>
+          <w:bCs/>
+        </w:rPr>
+        <w:t xml:space="preserve">Monotonia funcției de gradul I: </w:t>
+      </w:r>
+      <w:r>
+        <w:t xml:space="preserve">a &gt; 0  ⇒  strict crescătoare;   a &lt; 0  ⇒  strict descrescătoare</w:t>
+      </w:r>
+    </w:p>
+    <w:p>
+      <w:pPr>
+        <w:pStyle w:val="Heading2"/>
+        <w:spacing w:after="150" w:before="300"/>
+      </w:pPr>
+      <w:r>
+        <w:t xml:space="preserve">Funcția de gradul al II-lea</w:t>
+      </w:r>
+    </w:p>
+    <w:p>
+      <w:pPr>
+        <w:spacing w:after="100"/>
+      </w:pPr>
+      <w:r>
+        <w:rPr>
+          <w:b/>
+          <w:bCs/>
+        </w:rPr>
+        <w:t xml:space="preserve">Funcția de gradul al II-lea: </w:t>
+      </w:r>
+      <w:r>
+        <w:t xml:space="preserve">f(x) = ax² + bx + c,  a, b, c ∈ ℝ,  a ≠ 0</w:t>
+      </w:r>
+    </w:p>
+    <w:p>
+      <w:pPr>
+        <w:spacing w:after="100"/>
+      </w:pPr>
+      <w:r>
+        <w:rPr>
+          <w:b/>
+          <w:bCs/>
+        </w:rPr>
+        <w:t xml:space="preserve">Vârful parabolei: </w:t>
+      </w:r>
+      <w:r>
+        <w:t xml:space="preserve">V(−b/2a, −Δ/4a),  Δ = b² − 4ac</w:t>
+      </w:r>
+    </w:p>
+    <w:p>
+      <w:pPr>
+        <w:spacing w:after="100"/>
+      </w:pPr>
+      <w:r>
+        <w:rPr>
+          <w:b/>
+          <w:bCs/>
+        </w:rPr>
+        <w:t xml:space="preserve">Relațiile lui Viète: </w:t>
+      </w:r>
+      <w:r>
+        <w:t xml:space="preserve">x1 + x2 = −b/a,  x1 · x2 = c/a</w:t>
+      </w:r>
+    </w:p>
+    <w:p>
+      <w:pPr>
+        <w:pStyle w:val="Heading2"/>
+        <w:spacing w:after="150" w:before="300"/>
+      </w:pPr>
+      <w:r>
+        <w:t xml:space="preserve">Șiruri</w:t>
+      </w:r>
+    </w:p>
+    <w:p>
+      <w:pPr>
+        <w:spacing w:after="100"/>
+      </w:pPr>
+      <w:r>
+        <w:rPr>
+          <w:b/>
+          <w:bCs/>
+        </w:rPr>
+        <w:t xml:space="preserve">Progresia aritmetică — termenul general: </w:t>
+      </w:r>
+      <w:r>
+        <w:t xml:space="preserve">an = a1 + (n−1)·r</w:t>
+      </w:r>
+    </w:p>
+    <w:p>
+      <w:pPr>
+        <w:spacing w:after="100"/>
+      </w:pPr>
+      <w:r>
+        <w:rPr>
+          <w:b/>
+          <w:bCs/>
+        </w:rPr>
+        <w:t xml:space="preserve">Suma primilor n termeni (progresie aritmetică): </w:t>
+      </w:r>
+      <w:r>
+        <w:t xml:space="preserve">Sn = (a1 + an) · n / 2</w:t>
+      </w:r>
+    </w:p>
+    <w:p>
+      <w:pPr>
+        <w:spacing w:after="100"/>
+      </w:pPr>
+      <w:r>
+        <w:rPr>
+          <w:b/>
+          <w:bCs/>
+        </w:rPr>
+        <w:t xml:space="preserve">Progresia geometrică — termenul general: </w:t>
+      </w:r>
+      <w:r>
+        <w:t xml:space="preserve">bn = b1 · q^(n−1)</w:t>
+      </w:r>
+    </w:p>
+    <w:p>
+      <w:pPr>
+        <w:spacing w:after="100"/>
+      </w:pPr>
+      <w:r>
+        <w:rPr>
+          <w:b/>
+          <w:bCs/>
+        </w:rPr>
+        <w:t xml:space="preserve">Suma primilor n termeni (progresie geometrică, q≠1): </w:t>
+      </w:r>
+      <w:r>
+        <w:t xml:space="preserve">Sn = b1 · (qⁿ − 1) / (q − 1)</w:t>
       </w:r>
     </w:p>
     <w:sectPr>

</xml_diff>

<commit_message>
Address final review: fix English wording in formula sheet, restore Romanian quotes, document Topic/FORMULA_SHEET coupling
- src/data/formulaSheet.ts: three multimi-logica plain fields said "or"/"and"
  in English while their sibling latex fields (and every other chapter)
  used Romanian "sau"/"și" -- the downloadable PDF and Word formula
  sheets disagreed with each other as a result. Regenerated both files.
- src/data/theory/multimiLogica.ts, src/data/questions/multimiLogica.ts:
  restored the Romanian typographic quotes „...” the plan itself
  specified, in place of escaped ASCII quotes that were silently
  substituted during implementation.
- src/types.ts: added a comment on the Topic union documenting that new
  topics also need a FORMULA_SHEET chapter and a generate:formulas run,
  so the next contributor doesn't rediscover this the hard way.
</commit_message>
<xml_diff>
--- a/public/formule-bacalaureat.docx
+++ b/public/formule-bacalaureat.docx
@@ -789,7 +789,7 @@
         <w:t xml:space="preserve">Reuniunea mulțimilor: </w:t>
       </w:r>
       <w:r>
-        <w:t xml:space="preserve">A ∪ B = {x | x ∈ A or x ∈ B}</w:t>
+        <w:t xml:space="preserve">A ∪ B = {x | x ∈ A sau x ∈ B}</w:t>
       </w:r>
     </w:p>
     <w:p>
@@ -804,7 +804,7 @@
         <w:t xml:space="preserve">Intersecția mulțimilor: </w:t>
       </w:r>
       <w:r>
-        <w:t xml:space="preserve">A ∩ B = {x | x ∈ A and x ∈ B}</w:t>
+        <w:t xml:space="preserve">A ∩ B = {x | x ∈ A și x ∈ B}</w:t>
       </w:r>
     </w:p>
     <w:p>
@@ -819,7 +819,7 @@
         <w:t xml:space="preserve">Diferența mulțimilor: </w:t>
       </w:r>
       <w:r>
-        <w:t xml:space="preserve">A \ B = {x | x ∈ A and x ∉ B}</w:t>
+        <w:t xml:space="preserve">A \ B = {x | x ∈ A și x ∉ B}</w:t>
       </w:r>
     </w:p>
     <w:p>

</xml_diff>

<commit_message>
Add Statistică chapter (theory + exercises)
Also syncs the printable formula sheet (public/formule-bacalaureat.pdf
and .docx) to include the 4 new tenth-grade chapters added across this
plan (puteri-radicali-logaritmi, functii-exponentiale-logaritmice,
matematici-financiare, statistica), since editing
src/data/formulaSheet.ts requires regenerating those files per its own
header comment.
</commit_message>
<xml_diff>
--- a/public/formule-bacalaureat.docx
+++ b/public/formule-bacalaureat.docx
@@ -1012,6 +1012,207 @@
       </w:r>
       <w:r>
         <w:t xml:space="preserve">Sn = b1 · (qⁿ − 1) / (q − 1)</w:t>
+      </w:r>
+    </w:p>
+    <w:p>
+      <w:pPr>
+        <w:pStyle w:val="Heading2"/>
+        <w:spacing w:after="150" w:before="300"/>
+      </w:pPr>
+      <w:r>
+        <w:t xml:space="preserve">Puteri, radicali și logaritmi</w:t>
+      </w:r>
+    </w:p>
+    <w:p>
+      <w:pPr>
+        <w:spacing w:after="100"/>
+      </w:pPr>
+      <w:r>
+        <w:rPr>
+          <w:b/>
+          <w:bCs/>
+        </w:rPr>
+        <w:t xml:space="preserve">Puteri cu exponent rațional: </w:t>
+      </w:r>
+      <w:r>
+        <w:t xml:space="preserve">a^(p/q) = ᵍ√(a^p),  a &gt; 0</w:t>
+      </w:r>
+    </w:p>
+    <w:p>
+      <w:pPr>
+        <w:spacing w:after="100"/>
+      </w:pPr>
+      <w:r>
+        <w:rPr>
+          <w:b/>
+          <w:bCs/>
+        </w:rPr>
+        <w:t xml:space="preserve">Proprietăți ale logaritmilor: </w:t>
+      </w:r>
+      <w:r>
+        <w:t xml:space="preserve">log_a(xy) = log_a x + log_a y,  log_a(x/y) = log_a x − log_a y</w:t>
+      </w:r>
+    </w:p>
+    <w:p>
+      <w:pPr>
+        <w:spacing w:after="100"/>
+      </w:pPr>
+      <w:r>
+        <w:rPr>
+          <w:b/>
+          <w:bCs/>
+        </w:rPr>
+        <w:t xml:space="preserve">Media geometrică: </w:t>
+      </w:r>
+      <w:r>
+        <w:t xml:space="preserve">√(ab)</w:t>
+      </w:r>
+    </w:p>
+    <w:p>
+      <w:pPr>
+        <w:pStyle w:val="Heading2"/>
+        <w:spacing w:after="150" w:before="300"/>
+      </w:pPr>
+      <w:r>
+        <w:t xml:space="preserve">Funcții putere, radical, exponențială și logaritmică</w:t>
+      </w:r>
+    </w:p>
+    <w:p>
+      <w:pPr>
+        <w:spacing w:after="100"/>
+      </w:pPr>
+      <w:r>
+        <w:rPr>
+          <w:b/>
+          <w:bCs/>
+        </w:rPr>
+        <w:t xml:space="preserve">Funcția exponențială: </w:t>
+      </w:r>
+      <w:r>
+        <w:t xml:space="preserve">f(x) = aˣ,  a &gt; 0,  a ≠ 1</w:t>
+      </w:r>
+    </w:p>
+    <w:p>
+      <w:pPr>
+        <w:spacing w:after="100"/>
+      </w:pPr>
+      <w:r>
+        <w:rPr>
+          <w:b/>
+          <w:bCs/>
+        </w:rPr>
+        <w:t xml:space="preserve">Funcția logaritmică: </w:t>
+      </w:r>
+      <w:r>
+        <w:t xml:space="preserve">f(x) = log_a x,  a &gt; 0,  a ≠ 1,  x &gt; 0</w:t>
+      </w:r>
+    </w:p>
+    <w:p>
+      <w:pPr>
+        <w:spacing w:after="100"/>
+      </w:pPr>
+      <w:r>
+        <w:rPr>
+          <w:b/>
+          <w:bCs/>
+        </w:rPr>
+        <w:t xml:space="preserve">Rezolvarea ecuațiilor exponențiale prin substituție: </w:t>
+      </w:r>
+      <w:r>
+        <w:t xml:space="preserve">a^(2x) + b·aˣ + c = 0,  t = aˣ,  t &gt; 0</w:t>
+      </w:r>
+    </w:p>
+    <w:p>
+      <w:pPr>
+        <w:pStyle w:val="Heading2"/>
+        <w:spacing w:after="150" w:before="300"/>
+      </w:pPr>
+      <w:r>
+        <w:t xml:space="preserve">Matematici financiare</w:t>
+      </w:r>
+    </w:p>
+    <w:p>
+      <w:pPr>
+        <w:spacing w:after="100"/>
+      </w:pPr>
+      <w:r>
+        <w:rPr>
+          <w:b/>
+          <w:bCs/>
+        </w:rPr>
+        <w:t xml:space="preserve">Dobânda simplă: </w:t>
+      </w:r>
+      <w:r>
+        <w:t xml:space="preserve">D = C · p · n / 100</w:t>
+      </w:r>
+    </w:p>
+    <w:p>
+      <w:pPr>
+        <w:spacing w:after="100"/>
+      </w:pPr>
+      <w:r>
+        <w:rPr>
+          <w:b/>
+          <w:bCs/>
+        </w:rPr>
+        <w:t xml:space="preserve">Dobânda compusă: </w:t>
+      </w:r>
+      <w:r>
+        <w:t xml:space="preserve">S = C · (1 + p/100)ⁿ</w:t>
+      </w:r>
+    </w:p>
+    <w:p>
+      <w:pPr>
+        <w:spacing w:after="100"/>
+      </w:pPr>
+      <w:r>
+        <w:rPr>
+          <w:b/>
+          <w:bCs/>
+        </w:rPr>
+        <w:t xml:space="preserve">Prețul cu TVA: </w:t>
+      </w:r>
+      <w:r>
+        <w:t xml:space="preserve">P_TVA = P_net · (1 + p/100)</w:t>
+      </w:r>
+    </w:p>
+    <w:p>
+      <w:pPr>
+        <w:pStyle w:val="Heading2"/>
+        <w:spacing w:after="150" w:before="300"/>
+      </w:pPr>
+      <w:r>
+        <w:t xml:space="preserve">Statistică</w:t>
+      </w:r>
+    </w:p>
+    <w:p>
+      <w:pPr>
+        <w:spacing w:after="100"/>
+      </w:pPr>
+      <w:r>
+        <w:rPr>
+          <w:b/>
+          <w:bCs/>
+        </w:rPr>
+        <w:t xml:space="preserve">Frecvența relativă: </w:t>
+      </w:r>
+      <w:r>
+        <w:t xml:space="preserve">fr = (frecvența absolută) / (numărul total de date)</w:t>
+      </w:r>
+    </w:p>
+    <w:p>
+      <w:pPr>
+        <w:spacing w:after="100"/>
+      </w:pPr>
+      <w:r>
+        <w:rPr>
+          <w:b/>
+          <w:bCs/>
+        </w:rPr>
+        <w:t xml:space="preserve">Media aritmetică a unui set de date: </w:t>
+      </w:r>
+      <w:r>
+        <w:t xml:space="preserve">x̄ = (x1 + x2 + ... + xn) / n</w:t>
       </w:r>
     </w:p>
     <w:sectPr>

</xml_diff>

<commit_message>
Add l'Hospital's rule to Derivate topic (theory, exercise, formula sheet)
</commit_message>
<xml_diff>
--- a/public/formule-bacalaureat.docx
+++ b/public/formule-bacalaureat.docx
@@ -514,6 +514,21 @@
       </w:r>
       <w:r>
         <w:t xml:space="preserve">(u / v)' = (u'v − uv') / v²</w:t>
+      </w:r>
+    </w:p>
+    <w:p>
+      <w:pPr>
+        <w:spacing w:after="100"/>
+      </w:pPr>
+      <w:r>
+        <w:rPr>
+          <w:b/>
+          <w:bCs/>
+        </w:rPr>
+        <w:t xml:space="preserve">Regula lui l'Hospital: </w:t>
+      </w:r>
+      <w:r>
+        <w:t xml:space="preserve">lim f(x)/g(x) = lim f'(x)/g'(x)  (cazurile 0/0 sau ∞/∞)</w:t>
       </w:r>
     </w:p>
     <w:p>

</xml_diff>

<commit_message>
Add integration techniques (by parts, substitution) to Integrale topic (theory, exercises, formula sheet)
</commit_message>
<xml_diff>
--- a/public/formule-bacalaureat.docx
+++ b/public/formule-bacalaureat.docx
@@ -613,6 +613,36 @@
       </w:r>
       <w:r>
         <w:t xml:space="preserve">∫[a,b] f(x) dx = F(b) − F(a)</w:t>
+      </w:r>
+    </w:p>
+    <w:p>
+      <w:pPr>
+        <w:spacing w:after="100"/>
+      </w:pPr>
+      <w:r>
+        <w:rPr>
+          <w:b/>
+          <w:bCs/>
+        </w:rPr>
+        <w:t xml:space="preserve">Integrarea prin părți: </w:t>
+      </w:r>
+      <w:r>
+        <w:t xml:space="preserve">∫u·v' dx = u·v − ∫u'·v dx</w:t>
+      </w:r>
+    </w:p>
+    <w:p>
+      <w:pPr>
+        <w:spacing w:after="100"/>
+      </w:pPr>
+      <w:r>
+        <w:rPr>
+          <w:b/>
+          <w:bCs/>
+        </w:rPr>
+        <w:t xml:space="preserve">Integrarea prin schimbare de variabilă: </w:t>
+      </w:r>
+      <w:r>
+        <w:t xml:space="preserve">∫f(g(x))·g'(x) dx = F(g(x)) + C</w:t>
       </w:r>
     </w:p>
     <w:p>

</xml_diff>